<commit_message>
Predložak zajma: format po hrvatskoj praksi (TNR 12, centrirani članci)
Raspored kakav koriste javni bilježnici i Narodne novine: Times New Roman 12 pt,
naslov članka verzalom i centriran, ispod njega centrirano "Članak N.", tijelo
obostrano poravnato, margine 25 mm. Naslovi dobivaju keepNext (DOCX) i
break-after: avoid (HTML) da ne ostanu sami na dnu stranice.

Generator sada isti sadržaj emitira u dva formata — DOCX za potpisivanje i HTML
za pregled — pa render-pdf.sh radi PDF direktno iz HTML-a headless Chromeom.
Prije je išao preko pandoca, koji je gubio centriranje naslova.
</commit_message>
<xml_diff>
--- a/templates/vlastiti/ugovor-o-zajmu-konvertibilni.docx
+++ b/templates/vlastiti/ugovor-o-zajmu-konvertibilni.docx
@@ -5,87 +5,83 @@
     <w:p>
       <w:pPr>
         <w:jc w:val="center"/>
+        <w:spacing w:before="0" w:after="360"/>
+      </w:pPr>
+      <w:r>
+        <w:rPr>
+          <w:b/>
+          <w:sz w:val="28"/>
+        </w:rPr>
+        <w:t xml:space="preserve">UGOVOR O ZAJMU S PRAVOM KONVERZIJE U POSLOVNI UDIO</w:t>
+      </w:r>
+    </w:p>
+    <w:p>
+      <w:pPr>
+        <w:jc w:val="both"/>
+        <w:spacing w:before="0" w:after="200"/>
+      </w:pPr>
+      <w:r>
+        <w:t xml:space="preserve">sklopljen u {mjesto_sklapanja}, dana {datum_sklapanja} godine, između:</w:t>
+      </w:r>
+    </w:p>
+    <w:p>
+      <w:pPr>
+        <w:jc w:val="both"/>
+        <w:spacing w:before="0" w:after="120"/>
+      </w:pPr>
+      <w:r>
+        <w:t xml:space="preserve">1. {signer1_organization}, sa sjedištem u {signer1_address}, OIB: {signer1_organization_oib}, upisano u sudski registar pod MBS: {signer1_mbs}, koje zastupa {signer1_full_name} (u daljnjem tekstu: </w:t>
+      </w:r>
+      <w:r>
+        <w:rPr>
+          <w:b/>
+        </w:rPr>
+        <w:t xml:space="preserve">Zajmodavac</w:t>
+      </w:r>
+      <w:r>
+        <w:t xml:space="preserve">), i</w:t>
+      </w:r>
+    </w:p>
+    <w:p>
+      <w:pPr>
+        <w:jc w:val="both"/>
+        <w:spacing w:before="0" w:after="120"/>
+      </w:pPr>
+      <w:r>
+        <w:t xml:space="preserve">2. {signer2_organization}, sa sjedištem u {signer2_address}, OIB: {signer2_organization_oib}, upisano u sudski registar pod MBS: {signer2_mbs}, koje zastupa {signer2_full_name} (u daljnjem tekstu: </w:t>
+      </w:r>
+      <w:r>
+        <w:rPr>
+          <w:b/>
+        </w:rPr>
+        <w:t xml:space="preserve">Zajmoprimac</w:t>
+      </w:r>
+      <w:r>
+        <w:t xml:space="preserve">), te</w:t>
+      </w:r>
+    </w:p>
+    <w:p>
+      <w:pPr>
+        <w:jc w:val="both"/>
+        <w:spacing w:before="0" w:after="120"/>
+      </w:pPr>
+      <w:r>
+        <w:t xml:space="preserve">3. {signer3_full_name}, OIB: {signer3_oib}, iz {signer3_address}, koji je član Zajmoprimca s poslovnim udjelom od {signer3_udio_postotak}% temeljnog kapitala (u daljnjem tekstu: </w:t>
+      </w:r>
+      <w:r>
+        <w:rPr>
+          <w:b/>
+        </w:rPr>
+        <w:t xml:space="preserve">Član</w:t>
+      </w:r>
+      <w:r>
+        <w:t xml:space="preserve">), koji ovaj Ugovor sklapa isključivo radi preuzimanja obveza iz članaka 8. i 10. ovoga Ugovora</w:t>
+      </w:r>
+    </w:p>
+    <w:p>
+      <w:pPr>
+        <w:jc w:val="both"/>
         <w:spacing w:before="0" w:after="240"/>
-        <w:rPr>
-          <w:b/>
-          <w:sz w:val="28"/>
-        </w:rPr>
-      </w:pPr>
-      <w:r>
-        <w:rPr>
-          <w:b/>
-          <w:sz w:val="28"/>
-        </w:rPr>
-        <w:t xml:space="preserve">UGOVOR O ZAJMU S PRAVOM KONVERZIJE U POSLOVNI UDIO</w:t>
-      </w:r>
-    </w:p>
-    <w:p>
-      <w:pPr>
-        <w:jc w:val="both"/>
-        <w:spacing w:before="0" w:after="200"/>
-      </w:pPr>
-      <w:r>
-        <w:t xml:space="preserve">sklopljen u {mjesto_sklapanja}, dana {datum_sklapanja} godine, između:</w:t>
-      </w:r>
-    </w:p>
-    <w:p>
-      <w:pPr>
-        <w:jc w:val="both"/>
-        <w:spacing w:before="0" w:after="120"/>
-      </w:pPr>
-      <w:r>
-        <w:t xml:space="preserve">1. {signer1_organization}, sa sjedištem u {signer1_address}, OIB: {signer1_organization_oib}, upisano u sudski registar pod MBS: {signer1_mbs}, koje zastupa {signer1_full_name} (u daljnjem tekstu: </w:t>
-      </w:r>
-      <w:r>
-        <w:rPr>
-          <w:b/>
-        </w:rPr>
-        <w:t xml:space="preserve">Zajmodavac</w:t>
-      </w:r>
-      <w:r>
-        <w:t xml:space="preserve">), i</w:t>
-      </w:r>
-    </w:p>
-    <w:p>
-      <w:pPr>
-        <w:jc w:val="both"/>
-        <w:spacing w:before="0" w:after="120"/>
-      </w:pPr>
-      <w:r>
-        <w:t xml:space="preserve">2. {signer2_organization}, sa sjedištem u {signer2_address}, OIB: {signer2_organization_oib}, upisano u sudski registar pod MBS: {signer2_mbs}, koje zastupa {signer2_full_name} (u daljnjem tekstu: </w:t>
-      </w:r>
-      <w:r>
-        <w:rPr>
-          <w:b/>
-        </w:rPr>
-        <w:t xml:space="preserve">Zajmoprimac</w:t>
-      </w:r>
-      <w:r>
-        <w:t xml:space="preserve">), te</w:t>
-      </w:r>
-    </w:p>
-    <w:p>
-      <w:pPr>
-        <w:jc w:val="both"/>
-        <w:spacing w:before="0" w:after="120"/>
-      </w:pPr>
-      <w:r>
-        <w:t xml:space="preserve">3. {signer3_full_name}, OIB: {signer3_oib}, iz {signer3_address}, koji je član Zajmoprimca s poslovnim udjelom od {signer3_udio_postotak}% temeljnog kapitala (u daljnjem tekstu: </w:t>
-      </w:r>
-      <w:r>
-        <w:rPr>
-          <w:b/>
-        </w:rPr>
-        <w:t xml:space="preserve">Član</w:t>
-      </w:r>
-      <w:r>
-        <w:t xml:space="preserve">), koji ovaj Ugovor sklapa isključivo radi preuzimanja obveza iz članaka 8. i 10. ovoga Ugovora</w:t>
-      </w:r>
-    </w:p>
-    <w:p>
-      <w:pPr>
-        <w:jc w:val="both"/>
-        <w:spacing w:before="0" w:after="240"/>
       </w:pPr>
       <w:r>
         <w:t xml:space="preserve">(zajedno: </w:t>
@@ -102,17 +98,28 @@
     </w:p>
     <w:p>
       <w:pPr>
-        <w:jc w:val="left"/>
-        <w:spacing w:before="280" w:after="120"/>
-        <w:rPr>
-          <w:b/>
-        </w:rPr>
-      </w:pPr>
-      <w:r>
-        <w:rPr>
-          <w:b/>
-        </w:rPr>
-        <w:t xml:space="preserve">Članak 1. — Uvodne odredbe</w:t>
+        <w:keepNext/>
+        <w:jc w:val="center"/>
+        <w:spacing w:before="280" w:after="40"/>
+      </w:pPr>
+      <w:r>
+        <w:rPr>
+          <w:b/>
+        </w:rPr>
+        <w:t xml:space="preserve">UVODNE ODREDBE</w:t>
+      </w:r>
+    </w:p>
+    <w:p>
+      <w:pPr>
+        <w:keepNext/>
+        <w:jc w:val="center"/>
+        <w:spacing w:before="0" w:after="120"/>
+      </w:pPr>
+      <w:r>
+        <w:rPr>
+          <w:b/>
+        </w:rPr>
+        <w:t xml:space="preserve">Članak 1.</w:t>
       </w:r>
     </w:p>
     <w:p>
@@ -144,17 +151,28 @@
     </w:p>
     <w:p>
       <w:pPr>
-        <w:jc w:val="left"/>
-        <w:spacing w:before="280" w:after="120"/>
-        <w:rPr>
-          <w:b/>
-        </w:rPr>
-      </w:pPr>
-      <w:r>
-        <w:rPr>
-          <w:b/>
-        </w:rPr>
-        <w:t xml:space="preserve">Članak 2. — Predmet Ugovora i isplata zajma</w:t>
+        <w:keepNext/>
+        <w:jc w:val="center"/>
+        <w:spacing w:before="280" w:after="40"/>
+      </w:pPr>
+      <w:r>
+        <w:rPr>
+          <w:b/>
+        </w:rPr>
+        <w:t xml:space="preserve">PREDMET UGOVORA I ISPLATA ZAJMA</w:t>
+      </w:r>
+    </w:p>
+    <w:p>
+      <w:pPr>
+        <w:keepNext/>
+        <w:jc w:val="center"/>
+        <w:spacing w:before="0" w:after="120"/>
+      </w:pPr>
+      <w:r>
+        <w:rPr>
+          <w:b/>
+        </w:rPr>
+        <w:t xml:space="preserve">Članak 2.</w:t>
       </w:r>
     </w:p>
     <w:p>
@@ -195,17 +213,28 @@
     </w:p>
     <w:p>
       <w:pPr>
-        <w:jc w:val="left"/>
-        <w:spacing w:before="280" w:after="120"/>
-        <w:rPr>
-          <w:b/>
-        </w:rPr>
-      </w:pPr>
-      <w:r>
-        <w:rPr>
-          <w:b/>
-        </w:rPr>
-        <w:t xml:space="preserve">Članak 3. — Kamata</w:t>
+        <w:keepNext/>
+        <w:jc w:val="center"/>
+        <w:spacing w:before="280" w:after="40"/>
+      </w:pPr>
+      <w:r>
+        <w:rPr>
+          <w:b/>
+        </w:rPr>
+        <w:t xml:space="preserve">KAMATA</w:t>
+      </w:r>
+    </w:p>
+    <w:p>
+      <w:pPr>
+        <w:keepNext/>
+        <w:jc w:val="center"/>
+        <w:spacing w:before="0" w:after="120"/>
+      </w:pPr>
+      <w:r>
+        <w:rPr>
+          <w:b/>
+        </w:rPr>
+        <w:t xml:space="preserve">Članak 3.</w:t>
       </w:r>
     </w:p>
     <w:p>
@@ -237,17 +266,28 @@
     </w:p>
     <w:p>
       <w:pPr>
-        <w:jc w:val="left"/>
-        <w:spacing w:before="280" w:after="120"/>
-        <w:rPr>
-          <w:b/>
-        </w:rPr>
-      </w:pPr>
-      <w:r>
-        <w:rPr>
-          <w:b/>
-        </w:rPr>
-        <w:t xml:space="preserve">Članak 4. — Rok i način vraćanja</w:t>
+        <w:keepNext/>
+        <w:jc w:val="center"/>
+        <w:spacing w:before="280" w:after="40"/>
+      </w:pPr>
+      <w:r>
+        <w:rPr>
+          <w:b/>
+        </w:rPr>
+        <w:t xml:space="preserve">ROK I NAČIN VRAĆANJA</w:t>
+      </w:r>
+    </w:p>
+    <w:p>
+      <w:pPr>
+        <w:keepNext/>
+        <w:jc w:val="center"/>
+        <w:spacing w:before="0" w:after="120"/>
+      </w:pPr>
+      <w:r>
+        <w:rPr>
+          <w:b/>
+        </w:rPr>
+        <w:t xml:space="preserve">Članak 4.</w:t>
       </w:r>
     </w:p>
     <w:p>
@@ -297,17 +337,28 @@
     </w:p>
     <w:p>
       <w:pPr>
-        <w:jc w:val="left"/>
-        <w:spacing w:before="280" w:after="120"/>
-        <w:rPr>
-          <w:b/>
-        </w:rPr>
-      </w:pPr>
-      <w:r>
-        <w:rPr>
-          <w:b/>
-        </w:rPr>
-        <w:t xml:space="preserve">Članak 5. — Zakašnjenje</w:t>
+        <w:keepNext/>
+        <w:jc w:val="center"/>
+        <w:spacing w:before="280" w:after="40"/>
+      </w:pPr>
+      <w:r>
+        <w:rPr>
+          <w:b/>
+        </w:rPr>
+        <w:t xml:space="preserve">ZAKAŠNJENJE</w:t>
+      </w:r>
+    </w:p>
+    <w:p>
+      <w:pPr>
+        <w:keepNext/>
+        <w:jc w:val="center"/>
+        <w:spacing w:before="0" w:after="120"/>
+      </w:pPr>
+      <w:r>
+        <w:rPr>
+          <w:b/>
+        </w:rPr>
+        <w:t xml:space="preserve">Članak 5.</w:t>
       </w:r>
     </w:p>
     <w:p>
@@ -330,17 +381,28 @@
     </w:p>
     <w:p>
       <w:pPr>
-        <w:jc w:val="left"/>
-        <w:spacing w:before="280" w:after="120"/>
-        <w:rPr>
-          <w:b/>
-        </w:rPr>
-      </w:pPr>
-      <w:r>
-        <w:rPr>
-          <w:b/>
-        </w:rPr>
-        <w:t xml:space="preserve">Članak 6. — Pravo na konverziju (opcija Zajmodavca)</w:t>
+        <w:keepNext/>
+        <w:jc w:val="center"/>
+        <w:spacing w:before="280" w:after="40"/>
+      </w:pPr>
+      <w:r>
+        <w:rPr>
+          <w:b/>
+        </w:rPr>
+        <w:t xml:space="preserve">PRAVO NA KONVERZIJU (OPCIJA ZAJMODAVCA)</w:t>
+      </w:r>
+    </w:p>
+    <w:p>
+      <w:pPr>
+        <w:keepNext/>
+        <w:jc w:val="center"/>
+        <w:spacing w:before="0" w:after="120"/>
+      </w:pPr>
+      <w:r>
+        <w:rPr>
+          <w:b/>
+        </w:rPr>
+        <w:t xml:space="preserve">Članak 6.</w:t>
       </w:r>
     </w:p>
     <w:p>
@@ -465,17 +527,28 @@
     </w:p>
     <w:p>
       <w:pPr>
-        <w:jc w:val="left"/>
-        <w:spacing w:before="280" w:after="120"/>
-        <w:rPr>
-          <w:b/>
-        </w:rPr>
-      </w:pPr>
-      <w:r>
-        <w:rPr>
-          <w:b/>
-        </w:rPr>
-        <w:t xml:space="preserve">Članak 7. — Provedba konverzije</w:t>
+        <w:keepNext/>
+        <w:jc w:val="center"/>
+        <w:spacing w:before="280" w:after="40"/>
+      </w:pPr>
+      <w:r>
+        <w:rPr>
+          <w:b/>
+        </w:rPr>
+        <w:t xml:space="preserve">PROVEDBA KONVERZIJE</w:t>
+      </w:r>
+    </w:p>
+    <w:p>
+      <w:pPr>
+        <w:keepNext/>
+        <w:jc w:val="center"/>
+        <w:spacing w:before="0" w:after="120"/>
+      </w:pPr>
+      <w:r>
+        <w:rPr>
+          <w:b/>
+        </w:rPr>
+        <w:t xml:space="preserve">Članak 7.</w:t>
       </w:r>
     </w:p>
     <w:p>
@@ -566,17 +639,28 @@
     </w:p>
     <w:p>
       <w:pPr>
-        <w:jc w:val="left"/>
-        <w:spacing w:before="280" w:after="120"/>
-        <w:rPr>
-          <w:b/>
-        </w:rPr>
-      </w:pPr>
-      <w:r>
-        <w:rPr>
-          <w:b/>
-        </w:rPr>
-        <w:t xml:space="preserve">Članak 8. — Obveze Člana</w:t>
+        <w:keepNext/>
+        <w:jc w:val="center"/>
+        <w:spacing w:before="280" w:after="40"/>
+      </w:pPr>
+      <w:r>
+        <w:rPr>
+          <w:b/>
+        </w:rPr>
+        <w:t xml:space="preserve">OBVEZE ČLANA</w:t>
+      </w:r>
+    </w:p>
+    <w:p>
+      <w:pPr>
+        <w:keepNext/>
+        <w:jc w:val="center"/>
+        <w:spacing w:before="0" w:after="120"/>
+      </w:pPr>
+      <w:r>
+        <w:rPr>
+          <w:b/>
+        </w:rPr>
+        <w:t xml:space="preserve">Članak 8.</w:t>
       </w:r>
     </w:p>
     <w:p>
@@ -617,17 +701,28 @@
     </w:p>
     <w:p>
       <w:pPr>
-        <w:jc w:val="left"/>
-        <w:spacing w:before="280" w:after="120"/>
-        <w:rPr>
-          <w:b/>
-        </w:rPr>
-      </w:pPr>
-      <w:r>
-        <w:rPr>
-          <w:b/>
-        </w:rPr>
-        <w:t xml:space="preserve">Članak 9. — Obavijest o investicijskoj rundi</w:t>
+        <w:keepNext/>
+        <w:jc w:val="center"/>
+        <w:spacing w:before="280" w:after="40"/>
+      </w:pPr>
+      <w:r>
+        <w:rPr>
+          <w:b/>
+        </w:rPr>
+        <w:t xml:space="preserve">OBAVIJEST O INVESTICIJSKOJ RUNDI</w:t>
+      </w:r>
+    </w:p>
+    <w:p>
+      <w:pPr>
+        <w:keepNext/>
+        <w:jc w:val="center"/>
+        <w:spacing w:before="0" w:after="120"/>
+      </w:pPr>
+      <w:r>
+        <w:rPr>
+          <w:b/>
+        </w:rPr>
+        <w:t xml:space="preserve">Članak 9.</w:t>
       </w:r>
     </w:p>
     <w:p>
@@ -659,17 +754,28 @@
     </w:p>
     <w:p>
       <w:pPr>
-        <w:jc w:val="left"/>
-        <w:spacing w:before="280" w:after="120"/>
-        <w:rPr>
-          <w:b/>
-        </w:rPr>
-      </w:pPr>
-      <w:r>
-        <w:rPr>
-          <w:b/>
-        </w:rPr>
-        <w:t xml:space="preserve">Članak 10. — Ugovorna kazna</w:t>
+        <w:keepNext/>
+        <w:jc w:val="center"/>
+        <w:spacing w:before="280" w:after="40"/>
+      </w:pPr>
+      <w:r>
+        <w:rPr>
+          <w:b/>
+        </w:rPr>
+        <w:t xml:space="preserve">UGOVORNA KAZNA</w:t>
+      </w:r>
+    </w:p>
+    <w:p>
+      <w:pPr>
+        <w:keepNext/>
+        <w:jc w:val="center"/>
+        <w:spacing w:before="0" w:after="120"/>
+      </w:pPr>
+      <w:r>
+        <w:rPr>
+          <w:b/>
+        </w:rPr>
+        <w:t xml:space="preserve">Članak 10.</w:t>
       </w:r>
     </w:p>
     <w:p>
@@ -710,17 +816,28 @@
     </w:p>
     <w:p>
       <w:pPr>
-        <w:jc w:val="left"/>
-        <w:spacing w:before="280" w:after="120"/>
-        <w:rPr>
-          <w:b/>
-        </w:rPr>
-      </w:pPr>
-      <w:r>
-        <w:rPr>
-          <w:b/>
-        </w:rPr>
-        <w:t xml:space="preserve">Članak 11. — Izjave i jamstva Zajmoprimca i Člana</w:t>
+        <w:keepNext/>
+        <w:jc w:val="center"/>
+        <w:spacing w:before="280" w:after="40"/>
+      </w:pPr>
+      <w:r>
+        <w:rPr>
+          <w:b/>
+        </w:rPr>
+        <w:t xml:space="preserve">IZJAVE I JAMSTVA ZAJMOPRIMCA I ČLANA</w:t>
+      </w:r>
+    </w:p>
+    <w:p>
+      <w:pPr>
+        <w:keepNext/>
+        <w:jc w:val="center"/>
+        <w:spacing w:before="0" w:after="120"/>
+      </w:pPr>
+      <w:r>
+        <w:rPr>
+          <w:b/>
+        </w:rPr>
+        <w:t xml:space="preserve">Članak 11.</w:t>
       </w:r>
     </w:p>
     <w:p>
@@ -761,17 +878,28 @@
     </w:p>
     <w:p>
       <w:pPr>
-        <w:jc w:val="left"/>
-        <w:spacing w:before="280" w:after="120"/>
-        <w:rPr>
-          <w:b/>
-        </w:rPr>
-      </w:pPr>
-      <w:r>
-        <w:rPr>
-          <w:b/>
-        </w:rPr>
-        <w:t xml:space="preserve">Članak 12. — Povjerljivost</w:t>
+        <w:keepNext/>
+        <w:jc w:val="center"/>
+        <w:spacing w:before="280" w:after="40"/>
+      </w:pPr>
+      <w:r>
+        <w:rPr>
+          <w:b/>
+        </w:rPr>
+        <w:t xml:space="preserve">POVJERLJIVOST</w:t>
+      </w:r>
+    </w:p>
+    <w:p>
+      <w:pPr>
+        <w:keepNext/>
+        <w:jc w:val="center"/>
+        <w:spacing w:before="0" w:after="120"/>
+      </w:pPr>
+      <w:r>
+        <w:rPr>
+          <w:b/>
+        </w:rPr>
+        <w:t xml:space="preserve">Članak 12.</w:t>
       </w:r>
     </w:p>
     <w:p>
@@ -794,17 +922,28 @@
     </w:p>
     <w:p>
       <w:pPr>
-        <w:jc w:val="left"/>
-        <w:spacing w:before="280" w:after="120"/>
-        <w:rPr>
-          <w:b/>
-        </w:rPr>
-      </w:pPr>
-      <w:r>
-        <w:rPr>
-          <w:b/>
-        </w:rPr>
-        <w:t xml:space="preserve">Članak 13. — Obavijesti</w:t>
+        <w:keepNext/>
+        <w:jc w:val="center"/>
+        <w:spacing w:before="280" w:after="40"/>
+      </w:pPr>
+      <w:r>
+        <w:rPr>
+          <w:b/>
+        </w:rPr>
+        <w:t xml:space="preserve">OBAVIJESTI</w:t>
+      </w:r>
+    </w:p>
+    <w:p>
+      <w:pPr>
+        <w:keepNext/>
+        <w:jc w:val="center"/>
+        <w:spacing w:before="0" w:after="120"/>
+      </w:pPr>
+      <w:r>
+        <w:rPr>
+          <w:b/>
+        </w:rPr>
+        <w:t xml:space="preserve">Članak 13.</w:t>
       </w:r>
     </w:p>
     <w:p>
@@ -836,17 +975,28 @@
     </w:p>
     <w:p>
       <w:pPr>
-        <w:jc w:val="left"/>
-        <w:spacing w:before="280" w:after="120"/>
-        <w:rPr>
-          <w:b/>
-        </w:rPr>
-      </w:pPr>
-      <w:r>
-        <w:rPr>
-          <w:b/>
-        </w:rPr>
-        <w:t xml:space="preserve">Članak 14. — Mjerodavno pravo i rješavanje sporova</w:t>
+        <w:keepNext/>
+        <w:jc w:val="center"/>
+        <w:spacing w:before="280" w:after="40"/>
+      </w:pPr>
+      <w:r>
+        <w:rPr>
+          <w:b/>
+        </w:rPr>
+        <w:t xml:space="preserve">MJERODAVNO PRAVO I RJEŠAVANJE SPOROVA</w:t>
+      </w:r>
+    </w:p>
+    <w:p>
+      <w:pPr>
+        <w:keepNext/>
+        <w:jc w:val="center"/>
+        <w:spacing w:before="0" w:after="120"/>
+      </w:pPr>
+      <w:r>
+        <w:rPr>
+          <w:b/>
+        </w:rPr>
+        <w:t xml:space="preserve">Članak 14.</w:t>
       </w:r>
     </w:p>
     <w:p>
@@ -869,17 +1019,28 @@
     </w:p>
     <w:p>
       <w:pPr>
-        <w:jc w:val="left"/>
-        <w:spacing w:before="280" w:after="120"/>
-        <w:rPr>
-          <w:b/>
-        </w:rPr>
-      </w:pPr>
-      <w:r>
-        <w:rPr>
-          <w:b/>
-        </w:rPr>
-        <w:t xml:space="preserve">Članak 15. — Završne odredbe</w:t>
+        <w:keepNext/>
+        <w:jc w:val="center"/>
+        <w:spacing w:before="280" w:after="40"/>
+      </w:pPr>
+      <w:r>
+        <w:rPr>
+          <w:b/>
+        </w:rPr>
+        <w:t xml:space="preserve">ZAVRŠNE ODREDBE</w:t>
+      </w:r>
+    </w:p>
+    <w:p>
+      <w:pPr>
+        <w:keepNext/>
+        <w:jc w:val="center"/>
+        <w:spacing w:before="0" w:after="120"/>
+      </w:pPr>
+      <w:r>
+        <w:rPr>
+          <w:b/>
+        </w:rPr>
+        <w:t xml:space="preserve">Članak 15.</w:t>
       </w:r>
     </w:p>
     <w:p>
@@ -1065,7 +1226,7 @@
     </w:p>
     <w:sectPr>
       <w:pgSz w:w="11906" w:h="16838"/>
-      <w:pgMar w:top="1134" w:right="1134" w:bottom="1134" w:left="1134" w:header="709" w:footer="709"/>
+      <w:pgMar w:top="1417" w:right="1417" w:bottom="1417" w:left="1417" w:header="709" w:footer="709"/>
     </w:sectPr>
   </w:body>
 </w:document>
@@ -1076,15 +1237,15 @@
   <w:docDefaults>
     <w:rPrDefault>
       <w:rPr>
-        <w:rFonts w:ascii="Calibri" w:hAnsi="Calibri" w:cs="Calibri"/>
-        <w:sz w:val="22"/>
-        <w:szCs w:val="22"/>
+        <w:rFonts w:ascii="Times New Roman" w:hAnsi="Times New Roman" w:cs="Times New Roman"/>
+        <w:sz w:val="24"/>
+        <w:szCs w:val="24"/>
         <w:lang w:val="hr-HR"/>
       </w:rPr>
     </w:rPrDefault>
     <w:pPrDefault>
       <w:pPr>
-        <w:spacing w:after="120" w:line="276" w:lineRule="auto"/>
+        <w:spacing w:after="120" w:line="264" w:lineRule="auto"/>
       </w:pPr>
     </w:pPrDefault>
   </w:docDefaults>

</xml_diff>